<commit_message>
Adding Encasulation, array and string examples
</commit_message>
<xml_diff>
--- a/JavaTutorial/RoadMap.docx
+++ b/JavaTutorial/RoadMap.docx
@@ -43,7 +43,14 @@
           <w:b/>
           <w:bCs/>
         </w:rPr>
-        <w:t>Phase 1: Set Up Your Tools</w:t>
+        <w:t>Day</w:t>
+      </w:r>
+      <w:r>
+        <w:rPr>
+          <w:b/>
+          <w:bCs/>
+        </w:rPr>
+        <w:t xml:space="preserve"> 1: Set Up Your Tools</w:t>
       </w:r>
     </w:p>
     <w:p>
@@ -111,18 +118,13 @@
       <w:r>
         <w:t xml:space="preserve"> Download an Integrated Development Environment (IDE) to write your code. </w:t>
       </w:r>
+      <w:r>
+        <w:t>in</w:t>
+      </w:r>
+      <w:r>
+        <w:t xml:space="preserve"> include </w:t>
+      </w:r>
       <w:hyperlink r:id="rId8" w:tgtFrame="_blank" w:history="1">
-        <w:r>
-          <w:rPr>
-            <w:rStyle w:val="Hyperlink"/>
-          </w:rPr>
-          <w:t>JetBrains IntelliJ IDEA (Community Edition)</w:t>
-        </w:r>
-      </w:hyperlink>
-      <w:r>
-        <w:t xml:space="preserve"> is highly recommended for beginners. Alternative options include </w:t>
-      </w:r>
-      <w:hyperlink r:id="rId9" w:tgtFrame="_blank" w:history="1">
         <w:r>
           <w:rPr>
             <w:rStyle w:val="Hyperlink"/>
@@ -131,7 +133,10 @@
         </w:r>
       </w:hyperlink>
       <w:r>
-        <w:t xml:space="preserve"> or Eclipse.</w:t>
+        <w:t xml:space="preserve"> </w:t>
+      </w:r>
+      <w:r>
+        <w:t>with Java pack.</w:t>
       </w:r>
     </w:p>
     <w:p>
@@ -155,7 +160,14 @@
           <w:b/>
           <w:bCs/>
         </w:rPr>
-        <w:t>Phase 2: Learn Core Syntax</w:t>
+        <w:t>Day</w:t>
+      </w:r>
+      <w:r>
+        <w:rPr>
+          <w:b/>
+          <w:bCs/>
+        </w:rPr>
+        <w:t xml:space="preserve"> 2: Learn Core Syntax</w:t>
       </w:r>
     </w:p>
     <w:p>
@@ -201,18 +213,40 @@
           <w:b/>
           <w:bCs/>
         </w:rPr>
-        <w:t>Data Types:</w:t>
-      </w:r>
-      <w:r>
-        <w:t xml:space="preserve"> Differences between integers (int), decimals (double), characters (char), and true/false statements (</w:t>
-      </w:r>
-      <w:proofErr w:type="spellStart"/>
-      <w:r>
-        <w:t>boolean</w:t>
-      </w:r>
-      <w:proofErr w:type="spellEnd"/>
-      <w:r>
-        <w:t>).</w:t>
+        <w:t xml:space="preserve">Data </w:t>
+      </w:r>
+      <w:r>
+        <w:rPr>
+          <w:b/>
+          <w:bCs/>
+        </w:rPr>
+        <w:t>R</w:t>
+      </w:r>
+      <w:r>
+        <w:rPr>
+          <w:b/>
+          <w:bCs/>
+        </w:rPr>
+        <w:t>epresentation</w:t>
+      </w:r>
+      <w:r>
+        <w:rPr>
+          <w:b/>
+          <w:bCs/>
+        </w:rPr>
+        <w:t>:</w:t>
+      </w:r>
+      <w:r>
+        <w:t xml:space="preserve"> Bit, Byte,</w:t>
+      </w:r>
+      <w:r>
+        <w:t xml:space="preserve"> and HexDe</w:t>
+      </w:r>
+      <w:r>
+        <w:t>c</w:t>
+      </w:r>
+      <w:r>
+        <w:t>imal usage.</w:t>
       </w:r>
     </w:p>
     <w:p>
@@ -229,10 +263,10 @@
           <w:b/>
           <w:bCs/>
         </w:rPr>
-        <w:t>Control Flow:</w:t>
-      </w:r>
-      <w:r>
-        <w:t xml:space="preserve"> Using if/else conditions to make decisions.</w:t>
+        <w:t>Data Types:</w:t>
+      </w:r>
+      <w:r>
+        <w:t xml:space="preserve"> Differences between integers (int), decimals (double), characters (char), and true/false statements (boolean).</w:t>
       </w:r>
     </w:p>
     <w:p>
@@ -249,6 +283,26 @@
           <w:b/>
           <w:bCs/>
         </w:rPr>
+        <w:t>Control Flow:</w:t>
+      </w:r>
+      <w:r>
+        <w:t xml:space="preserve"> Using if/else conditions to make decisions.</w:t>
+      </w:r>
+    </w:p>
+    <w:p>
+      <w:pPr>
+        <w:numPr>
+          <w:ilvl w:val="0"/>
+          <w:numId w:val="2"/>
+        </w:numPr>
+        <w:spacing w:after="0" w:line="240" w:lineRule="auto"/>
+        <w:contextualSpacing/>
+      </w:pPr>
+      <w:r>
+        <w:rPr>
+          <w:b/>
+          <w:bCs/>
+        </w:rPr>
         <w:t>Loops:</w:t>
       </w:r>
       <w:r>
@@ -282,7 +336,14 @@
           <w:b/>
           <w:bCs/>
         </w:rPr>
-        <w:t>Phase 3: Understand Object-Oriented Programming (OOP)</w:t>
+        <w:t>Day</w:t>
+      </w:r>
+      <w:r>
+        <w:rPr>
+          <w:b/>
+          <w:bCs/>
+        </w:rPr>
+        <w:t xml:space="preserve"> 3: Understand Object-Oriented Programming (OOP)</w:t>
       </w:r>
     </w:p>
     <w:p>
@@ -291,40 +352,7 @@
         <w:contextualSpacing/>
       </w:pPr>
       <w:r>
-        <w:t>Java is fundamentally built on OOP. This means you organize your code into modular, reusable blocks. Master these four pillars: [</w:t>
-      </w:r>
-      <w:hyperlink r:id="rId10" w:history="1">
-        <w:r>
-          <w:rPr>
-            <w:rStyle w:val="Hyperlink"/>
-          </w:rPr>
-          <w:t>1</w:t>
-        </w:r>
-      </w:hyperlink>
-      <w:r>
-        <w:t xml:space="preserve">, </w:t>
-      </w:r>
-      <w:hyperlink r:id="rId11" w:history="1">
-        <w:r>
-          <w:rPr>
-            <w:rStyle w:val="Hyperlink"/>
-          </w:rPr>
-          <w:t>2</w:t>
-        </w:r>
-      </w:hyperlink>
-      <w:r>
-        <w:t xml:space="preserve">, </w:t>
-      </w:r>
-      <w:hyperlink r:id="rId12" w:history="1">
-        <w:r>
-          <w:rPr>
-            <w:rStyle w:val="Hyperlink"/>
-          </w:rPr>
-          <w:t>3</w:t>
-        </w:r>
-      </w:hyperlink>
-      <w:r>
-        <w:t>]</w:t>
+        <w:t>Java is fundamentally built on OOP. This means you organize your code into modular, reusable blocks. Master these four pillars:</w:t>
       </w:r>
     </w:p>
     <w:p>
@@ -428,108 +456,91 @@
           <w:b/>
           <w:bCs/>
         </w:rPr>
-        <w:t xml:space="preserve">Phase 4: </w:t>
+        <w:t>Phase</w:t>
       </w:r>
       <w:r>
         <w:rPr>
           <w:b/>
           <w:bCs/>
         </w:rPr>
-        <w:t xml:space="preserve">Advance Java Data structure and </w:t>
+        <w:t xml:space="preserve"> </w:t>
       </w:r>
       <w:r>
         <w:rPr>
           <w:b/>
           <w:bCs/>
         </w:rPr>
-        <w:t>Data Handling &amp; Lists</w:t>
-      </w:r>
-    </w:p>
-    <w:p>
-      <w:pPr>
-        <w:spacing w:after="0" w:line="240" w:lineRule="auto"/>
-        <w:contextualSpacing/>
-      </w:pPr>
-      <w:r>
-        <w:t xml:space="preserve">Programs need to manage groups of information. You will want to study: </w:t>
-      </w:r>
-    </w:p>
-    <w:p>
-      <w:pPr>
-        <w:numPr>
-          <w:ilvl w:val="0"/>
-          <w:numId w:val="4"/>
-        </w:numPr>
-        <w:spacing w:after="0" w:line="240" w:lineRule="auto"/>
-        <w:contextualSpacing/>
-      </w:pPr>
+        <w:t>4</w:t>
+      </w:r>
       <w:r>
         <w:rPr>
           <w:b/>
           <w:bCs/>
         </w:rPr>
-        <w:t>Arrays:</w:t>
-      </w:r>
-      <w:r>
-        <w:t xml:space="preserve"> Fixed-size lists used to store similar items.</w:t>
-      </w:r>
-    </w:p>
-    <w:p>
-      <w:pPr>
-        <w:numPr>
-          <w:ilvl w:val="0"/>
-          <w:numId w:val="4"/>
-        </w:numPr>
-        <w:spacing w:after="0" w:line="240" w:lineRule="auto"/>
-        <w:contextualSpacing/>
-      </w:pPr>
-      <w:proofErr w:type="spellStart"/>
+        <w:t xml:space="preserve">: </w:t>
+      </w:r>
       <w:r>
         <w:rPr>
           <w:b/>
           <w:bCs/>
         </w:rPr>
-        <w:t>ArrayLists</w:t>
-      </w:r>
-      <w:proofErr w:type="spellEnd"/>
-      <w:r>
+        <w:t>Mini project</w:t>
+      </w:r>
+    </w:p>
+    <w:p>
+      <w:pPr>
+        <w:spacing w:after="120" w:line="240" w:lineRule="auto"/>
+      </w:pPr>
+      <w:r>
+        <w:t>B</w:t>
+      </w:r>
+      <w:r>
+        <w:t>uild a Student Grade &amp; Honor Roll Tracker</w:t>
+      </w:r>
+    </w:p>
+    <w:p>
+      <w:pPr>
+        <w:spacing w:after="120" w:line="240" w:lineRule="auto"/>
+      </w:pPr>
+      <w:r>
+        <w:t>-----------------------------------------------------------------------------------------------------------------------------------</w:t>
+      </w:r>
+    </w:p>
+    <w:p>
+      <w:pPr>
+        <w:spacing w:after="120" w:line="240" w:lineRule="auto"/>
         <w:rPr>
           <w:b/>
           <w:bCs/>
         </w:rPr>
-        <w:t>:</w:t>
-      </w:r>
-      <w:r>
-        <w:t xml:space="preserve"> Dynamic lists that automatically grow or shrink when you add or remove items.</w:t>
-      </w:r>
-    </w:p>
-    <w:p>
-      <w:pPr>
-        <w:numPr>
-          <w:ilvl w:val="0"/>
-          <w:numId w:val="4"/>
-        </w:numPr>
-        <w:spacing w:after="0" w:line="240" w:lineRule="auto"/>
-        <w:contextualSpacing/>
-      </w:pPr>
-      <w:proofErr w:type="spellStart"/>
+      </w:pPr>
       <w:r>
         <w:rPr>
           <w:b/>
           <w:bCs/>
         </w:rPr>
-        <w:t>HashMaps</w:t>
-      </w:r>
-      <w:proofErr w:type="spellEnd"/>
+        <w:t xml:space="preserve">Phase </w:t>
+      </w:r>
       <w:r>
         <w:rPr>
           <w:b/>
           <w:bCs/>
         </w:rPr>
-        <w:t>:</w:t>
-      </w:r>
-      <w:r>
-        <w:t xml:space="preserve"> Key-value pairs used for rapid data lookups. </w:t>
+        <w:t>5</w:t>
+      </w:r>
+      <w:r>
+        <w:rPr>
+          <w:b/>
+          <w:bCs/>
+        </w:rPr>
+        <w:t xml:space="preserve">: </w:t>
+      </w:r>
+      <w:r>
+        <w:rPr>
+          <w:b/>
+          <w:bCs/>
+        </w:rPr>
+        <w:t>Git and GitHub basics</w:t>
       </w:r>
     </w:p>
     <w:p>
@@ -537,15 +548,24 @@
         <w:spacing w:after="0" w:line="240" w:lineRule="auto"/>
         <w:contextualSpacing/>
       </w:pPr>
+      <w:r>
+        <w:t xml:space="preserve"> </w:t>
+      </w:r>
     </w:p>
     <w:p>
       <w:pPr>
+        <w:spacing w:after="0" w:line="240" w:lineRule="auto"/>
+        <w:contextualSpacing/>
+      </w:pPr>
+    </w:p>
+    <w:p>
+      <w:pPr>
         <w:spacing w:after="120" w:line="240" w:lineRule="auto"/>
       </w:pPr>
     </w:p>
     <w:sectPr>
-      <w:headerReference w:type="default" r:id="rId13"/>
-      <w:footerReference w:type="default" r:id="rId14"/>
+      <w:headerReference w:type="default" r:id="rId9"/>
+      <w:footerReference w:type="default" r:id="rId10"/>
       <w:pgSz w:w="12240" w:h="15840"/>
       <w:pgMar w:top="720" w:right="720" w:bottom="720" w:left="720" w:header="720" w:footer="720" w:gutter="0"/>
       <w:cols w:space="720"/>

</xml_diff>